<commit_message>
test plan sprint 3 p1
</commit_message>
<xml_diff>
--- a/SCI_SE_01.ProjectProposal.docx
+++ b/SCI_SE_01.ProjectProposal.docx
@@ -8227,16 +8227,9 @@
           <w:rFonts w:cs="Times New Roman"/>
           <w:bCs/>
           <w:szCs w:val="26"/>
-        </w:rPr>
-      </w:pPr>
-      <w:r>
-        <w:rPr>
-          <w:rFonts w:cs="Times New Roman"/>
-          <w:bCs/>
-          <w:szCs w:val="26"/>
-        </w:rPr>
-        <w:br w:type="page"/>
-      </w:r>
+          <w:lang w:val="vi-VN"/>
+        </w:rPr>
+      </w:pPr>
     </w:p>
     <w:p>
       <w:pPr>
@@ -8264,7 +8257,6 @@
           <w:sz w:val="26"/>
           <w:szCs w:val="26"/>
         </w:rPr>
-        <w:lastRenderedPageBreak/>
         <w:t>Mô tả</w:t>
       </w:r>
       <w:bookmarkEnd w:id="33"/>
@@ -9713,6 +9705,7 @@
           <w:sz w:val="26"/>
           <w:szCs w:val="26"/>
         </w:rPr>
+        <w:lastRenderedPageBreak/>
         <w:t>Các công nghệ ràng buộc</w:t>
       </w:r>
       <w:bookmarkEnd w:id="36"/>
@@ -9837,7 +9830,6 @@
           <w:rFonts w:cs="Times New Roman"/>
           <w:szCs w:val="26"/>
         </w:rPr>
-        <w:lastRenderedPageBreak/>
         <w:t>Cơ sở dữ liệu: MySQL.</w:t>
       </w:r>
     </w:p>
@@ -10324,7 +10316,15 @@
           <w:rFonts w:cs="Times New Roman"/>
           <w:szCs w:val="26"/>
         </w:rPr>
-        <w:t>: Chủ sở hữu sản phẩm tập trung vào các yêu cầu kinh doanh và thị trường, ưu tiên tất cả các công việc cần được thực hiện. Anh ấy hoặc cô ấy xây dựng và quản lý công việc tồn đọng, cung cấp hướng dẫn về các tính năng cần vận chuyển tiếp theo, đồng thời tương tác với nhóm và các bên liên quan khác để đảm bảo mọi người đều hiểu các mục trong sản phẩm tồn đọng. Product Owner không phải là người quản lý dự án. Thay vì quản lý tình trạng và tiến độ, công việc của anh ta hoặc cô ta là thúc đẩy nhóm với mục tiêu và tầm nhìn.</w:t>
+        <w:t xml:space="preserve">: Chủ sở hữu sản phẩm tập trung vào các yêu cầu kinh doanh và thị trường, ưu tiên tất cả các công việc cần được thực hiện. Anh ấy hoặc cô ấy xây dựng và quản lý công việc tồn đọng, cung cấp hướng dẫn về các tính năng cần vận chuyển tiếp theo, đồng thời tương tác với nhóm và các bên liên quan khác để đảm </w:t>
+      </w:r>
+      <w:r>
+        <w:rPr>
+          <w:rFonts w:cs="Times New Roman"/>
+          <w:szCs w:val="26"/>
+        </w:rPr>
+        <w:lastRenderedPageBreak/>
+        <w:t>bảo mọi người đều hiểu các mục trong sản phẩm tồn đọng. Product Owner không phải là người quản lý dự án. Thay vì quản lý tình trạng và tiến độ, công việc của anh ta hoặc cô ta là thúc đẩy nhóm với mục tiêu và tầm nhìn.</w:t>
       </w:r>
     </w:p>
     <w:p>
@@ -10346,7 +10346,6 @@
           <w:b/>
           <w:szCs w:val="26"/>
         </w:rPr>
-        <w:lastRenderedPageBreak/>
         <w:t>Scrum Master</w:t>
       </w:r>
       <w:r>

</xml_diff>